<commit_message>
Update portfolio: add Unity 6 VR simulator, Phaser 3 games, and updated resume
</commit_message>
<xml_diff>
--- a/Resume_Python_Developer.docx
+++ b/Resume_Python_Developer.docx
@@ -2,325 +2,373 @@
 <file path=word/document.xml><?xml version="1.0" encoding="utf-8"?>
 <w:document xmlns:wpc="http://schemas.microsoft.com/office/word/2010/wordprocessingCanvas" xmlns:mo="http://schemas.microsoft.com/office/mac/office/2008/main" xmlns:mc="http://schemas.openxmlformats.org/markup-compatibility/2006" xmlns:mv="urn:schemas-microsoft-com:mac:vml" xmlns:o="urn:schemas-microsoft-com:office:office" xmlns:r="http://schemas.openxmlformats.org/officeDocument/2006/relationships" xmlns:m="http://schemas.openxmlformats.org/officeDocument/2006/math" xmlns:v="urn:schemas-microsoft-com:vml" xmlns:wp14="http://schemas.microsoft.com/office/word/2010/wordprocessingDrawing" xmlns:wp="http://schemas.openxmlformats.org/drawingml/2006/wordprocessingDrawing" xmlns:w10="urn:schemas-microsoft-com:office:word" xmlns:w="http://schemas.openxmlformats.org/wordprocessingml/2006/main" xmlns:w14="http://schemas.microsoft.com/office/word/2010/wordml" xmlns:wpg="http://schemas.microsoft.com/office/word/2010/wordprocessingGroup" xmlns:wpi="http://schemas.microsoft.com/office/word/2010/wordprocessingInk" xmlns:wne="http://schemas.microsoft.com/office/word/2006/wordml" xmlns:wps="http://schemas.microsoft.com/office/word/2010/wordprocessingShape" mc:Ignorable="w14 wp14">
   <w:body>
+    <w:tbl>
+      <w:tblPr>
+        <w:tblW w:type="auto" w:w="0"/>
+        <w:jc w:val="center"/>
+        <w:tblLayout w:type="fixed"/>
+        <w:tblLook w:firstColumn="1" w:firstRow="1" w:lastColumn="0" w:lastRow="0" w:noHBand="0" w:noVBand="1" w:val="04A0"/>
+      </w:tblPr>
+      <w:tblGrid>
+        <w:gridCol w:w="10800"/>
+      </w:tblGrid>
+      <w:tr>
+        <w:tc>
+          <w:tcPr>
+            <w:tcW w:type="dxa" w:w="10800"/>
+            <w:shd w:fill="F0F9FF"/>
+          </w:tcPr>
+          <w:p>
+            <w:pPr>
+              <w:spacing w:before="160" w:after="40"/>
+            </w:pPr>
+            <w:r>
+              <w:rPr>
+                <w:rFonts w:ascii="Arial" w:hAnsi="Arial"/>
+                <w:b/>
+                <w:color w:val="0E7490"/>
+                <w:sz w:val="34"/>
+              </w:rPr>
+              <w:t>РОЖДЕСТВЕНСКИЙ ДАНИИЛ АНДРЕЕВИЧ</w:t>
+            </w:r>
+          </w:p>
+          <w:p>
+            <w:pPr>
+              <w:spacing w:before="0" w:after="80"/>
+            </w:pPr>
+            <w:r>
+              <w:rPr>
+                <w:rFonts w:ascii="Arial" w:hAnsi="Arial"/>
+                <w:b/>
+                <w:color w:val="0F172A"/>
+                <w:sz w:val="22"/>
+              </w:rPr>
+              <w:t>Python &amp; C# Developer  |  Unity VR, Backend, Telegram Services &amp; GameDev</w:t>
+            </w:r>
+          </w:p>
+          <w:p>
+            <w:pPr>
+              <w:spacing w:before="0" w:after="160"/>
+            </w:pPr>
+            <w:r>
+              <w:rPr>
+                <w:rFonts w:ascii="Arial" w:hAnsi="Arial"/>
+                <w:color w:val="475569"/>
+                <w:sz w:val="19"/>
+              </w:rPr>
+              <w:t>Локация: Донецк (готов к удаленной работе / релокации)  |  Служба в армии: Пройдена (военный билет на руках)</w:t>
+              <w:br/>
+              <w:t>Telegram: @Eksailed  |  GitHub: github.com/Eksailed</w:t>
+            </w:r>
+          </w:p>
+        </w:tc>
+      </w:tr>
+    </w:tbl>
+    <w:p>
+      <w:pPr>
+        <w:spacing w:before="200" w:after="60"/>
+        <w:pBdr>
+          <w:bottom w:val="single" w:sz="8" w:space="2" w:color="0EA5E9"/>
+        </w:pBdr>
+      </w:pPr>
+      <w:r>
+        <w:rPr>
+          <w:rFonts w:ascii="Arial" w:hAnsi="Arial"/>
+          <w:b/>
+          <w:color w:val="0E7490"/>
+          <w:sz w:val="22"/>
+        </w:rPr>
+        <w:t>О СЕБЕ</w:t>
+      </w:r>
+    </w:p>
+    <w:p>
+      <w:pPr>
+        <w:spacing w:before="60" w:after="80"/>
+      </w:pPr>
+      <w:r>
+        <w:rPr>
+          <w:rFonts w:ascii="Arial" w:hAnsi="Arial"/>
+          <w:color w:val="0F172A"/>
+          <w:sz w:val="19"/>
+        </w:rPr>
+        <w:t>Разработчик на Python и C# с практическим опытом создания высоконагруженных бэкенд-сервисов (FastAPI, PostgreSQL, Redis, aiogram), VR-симуляторов и 3D-механик на Unity 6 (XR Interaction Toolkit, OpenXR), веб-игр на JavaScript / Phaser 3 с монетизацией Яндекс.Игр и десктопного ПО (WinForms, C++). Студент 2-го курса ДонНУ с дипломом СПО (выпускник техникума ДТПА). Срочная служба в Вооруженных Силах РФ пройдена — военный билет на руках, юридический вопрос с призывом закрыт полностью. Ориентирован на чистую архитектуру, соблюдение паттернов ООП, качественное тестирование и доведение проектов до продакшна.</w:t>
+      </w:r>
+    </w:p>
+    <w:p>
+      <w:pPr>
+        <w:spacing w:before="200" w:after="60"/>
+        <w:pBdr>
+          <w:bottom w:val="single" w:sz="8" w:space="2" w:color="0EA5E9"/>
+        </w:pBdr>
+      </w:pPr>
+      <w:r>
+        <w:rPr>
+          <w:rFonts w:ascii="Arial" w:hAnsi="Arial"/>
+          <w:b/>
+          <w:color w:val="0E7490"/>
+          <w:sz w:val="22"/>
+        </w:rPr>
+        <w:t>КЛЮЧЕВЫЕ НАВЫКИ И СТЕК</w:t>
+      </w:r>
+    </w:p>
+    <w:p>
+      <w:pPr>
+        <w:spacing w:before="20" w:after="40"/>
+        <w:ind w:left="288"/>
+      </w:pPr>
+      <w:r>
+        <w:rPr>
+          <w:rFonts w:ascii="Arial" w:hAnsi="Arial"/>
+          <w:color w:val="0E7490"/>
+          <w:sz w:val="19"/>
+        </w:rPr>
+        <w:t xml:space="preserve">•  </w:t>
+      </w:r>
+      <w:r>
+        <w:rPr>
+          <w:rFonts w:ascii="Arial" w:hAnsi="Arial"/>
+          <w:b/>
+          <w:color w:val="0F172A"/>
+          <w:sz w:val="19"/>
+        </w:rPr>
+        <w:t xml:space="preserve">Языки программирования: </w:t>
+      </w:r>
+      <w:r>
+        <w:rPr>
+          <w:rFonts w:ascii="Arial" w:hAnsi="Arial"/>
+          <w:color w:val="0F172A"/>
+          <w:sz w:val="19"/>
+        </w:rPr>
+        <w:t>Python 3.10–3.12, C#, C++, JavaScript (ES6+), SQL, базовый TypeScript</w:t>
+      </w:r>
+    </w:p>
+    <w:p>
+      <w:pPr>
+        <w:spacing w:before="20" w:after="40"/>
+        <w:ind w:left="288"/>
+      </w:pPr>
+      <w:r>
+        <w:rPr>
+          <w:rFonts w:ascii="Arial" w:hAnsi="Arial"/>
+          <w:color w:val="0E7490"/>
+          <w:sz w:val="19"/>
+        </w:rPr>
+        <w:t xml:space="preserve">•  </w:t>
+      </w:r>
+      <w:r>
+        <w:rPr>
+          <w:rFonts w:ascii="Arial" w:hAnsi="Arial"/>
+          <w:b/>
+          <w:color w:val="0F172A"/>
+          <w:sz w:val="19"/>
+        </w:rPr>
+        <w:t xml:space="preserve">Бэкенд и фреймворки: </w:t>
+      </w:r>
+      <w:r>
+        <w:rPr>
+          <w:rFonts w:ascii="Arial" w:hAnsi="Arial"/>
+          <w:color w:val="0F172A"/>
+          <w:sz w:val="19"/>
+        </w:rPr>
+        <w:t>FastAPI, Uvicorn, Pydantic v2, aiogram 3.x, python-telegram-bot (v21 async), httpx, aiohttp</w:t>
+      </w:r>
+    </w:p>
+    <w:p>
+      <w:pPr>
+        <w:spacing w:before="20" w:after="40"/>
+        <w:ind w:left="288"/>
+      </w:pPr>
+      <w:r>
+        <w:rPr>
+          <w:rFonts w:ascii="Arial" w:hAnsi="Arial"/>
+          <w:color w:val="0E7490"/>
+          <w:sz w:val="19"/>
+        </w:rPr>
+        <w:t xml:space="preserve">•  </w:t>
+      </w:r>
+      <w:r>
+        <w:rPr>
+          <w:rFonts w:ascii="Arial" w:hAnsi="Arial"/>
+          <w:b/>
+          <w:color w:val="0F172A"/>
+          <w:sz w:val="19"/>
+        </w:rPr>
+        <w:t xml:space="preserve">GameDev &amp; VR: </w:t>
+      </w:r>
+      <w:r>
+        <w:rPr>
+          <w:rFonts w:ascii="Arial" w:hAnsi="Arial"/>
+          <w:color w:val="0F172A"/>
+          <w:sz w:val="19"/>
+        </w:rPr>
+        <w:t>Unity 6000.0 (Unity 6), XR Interaction Toolkit 3.0.7, OpenXR 1.14.0, XR Device Simulator, Phaser 3, WebGL Canvas, FSM AI, 3D Physics</w:t>
+      </w:r>
+    </w:p>
+    <w:p>
+      <w:pPr>
+        <w:spacing w:before="20" w:after="40"/>
+        <w:ind w:left="288"/>
+      </w:pPr>
+      <w:r>
+        <w:rPr>
+          <w:rFonts w:ascii="Arial" w:hAnsi="Arial"/>
+          <w:color w:val="0E7490"/>
+          <w:sz w:val="19"/>
+        </w:rPr>
+        <w:t xml:space="preserve">•  </w:t>
+      </w:r>
+      <w:r>
+        <w:rPr>
+          <w:rFonts w:ascii="Arial" w:hAnsi="Arial"/>
+          <w:b/>
+          <w:color w:val="0F172A"/>
+          <w:sz w:val="19"/>
+        </w:rPr>
+        <w:t xml:space="preserve">Базы данных и ORM: </w:t>
+      </w:r>
+      <w:r>
+        <w:rPr>
+          <w:rFonts w:ascii="Arial" w:hAnsi="Arial"/>
+          <w:color w:val="0F172A"/>
+          <w:sz w:val="19"/>
+        </w:rPr>
+        <w:t>PostgreSQL, SQLite, SQLAlchemy 2.0 (Asyncio), asyncpg, Alembic (миграции), Redis</w:t>
+      </w:r>
+    </w:p>
+    <w:p>
+      <w:pPr>
+        <w:spacing w:before="20" w:after="40"/>
+        <w:ind w:left="288"/>
+      </w:pPr>
+      <w:r>
+        <w:rPr>
+          <w:rFonts w:ascii="Arial" w:hAnsi="Arial"/>
+          <w:color w:val="0E7490"/>
+          <w:sz w:val="19"/>
+        </w:rPr>
+        <w:t xml:space="preserve">•  </w:t>
+      </w:r>
+      <w:r>
+        <w:rPr>
+          <w:rFonts w:ascii="Arial" w:hAnsi="Arial"/>
+          <w:b/>
+          <w:color w:val="0F172A"/>
+          <w:sz w:val="19"/>
+        </w:rPr>
+        <w:t xml:space="preserve">Интеграции и AI: </w:t>
+      </w:r>
+      <w:r>
+        <w:rPr>
+          <w:rFonts w:ascii="Arial" w:hAnsi="Arial"/>
+          <w:color w:val="0F172A"/>
+          <w:sz w:val="19"/>
+        </w:rPr>
+        <w:t>OpenRouter API (Qwen 2.5 72B), Prompt Engineering, Telegram Stars, Yandex Games SDK v2 (монетизация, реклама, облачные сохранения), Swiss Ephemeris</w:t>
+      </w:r>
+    </w:p>
+    <w:p>
+      <w:pPr>
+        <w:spacing w:before="20" w:after="40"/>
+        <w:ind w:left="288"/>
+      </w:pPr>
+      <w:r>
+        <w:rPr>
+          <w:rFonts w:ascii="Arial" w:hAnsi="Arial"/>
+          <w:color w:val="0E7490"/>
+          <w:sz w:val="19"/>
+        </w:rPr>
+        <w:t xml:space="preserve">•  </w:t>
+      </w:r>
+      <w:r>
+        <w:rPr>
+          <w:rFonts w:ascii="Arial" w:hAnsi="Arial"/>
+          <w:b/>
+          <w:color w:val="0F172A"/>
+          <w:sz w:val="19"/>
+        </w:rPr>
+        <w:t xml:space="preserve">Десктоп и Frontend: </w:t>
+      </w:r>
+      <w:r>
+        <w:rPr>
+          <w:rFonts w:ascii="Arial" w:hAnsi="Arial"/>
+          <w:color w:val="0F172A"/>
+          <w:sz w:val="19"/>
+        </w:rPr>
+        <w:t>Windows Forms (C#), WPF, прикладные базы данных, алгоритмы на C++, React 18, Tailwind CSS, Vite</w:t>
+      </w:r>
+    </w:p>
+    <w:p>
+      <w:pPr>
+        <w:spacing w:before="20" w:after="40"/>
+        <w:ind w:left="288"/>
+      </w:pPr>
+      <w:r>
+        <w:rPr>
+          <w:rFonts w:ascii="Arial" w:hAnsi="Arial"/>
+          <w:color w:val="0E7490"/>
+          <w:sz w:val="19"/>
+        </w:rPr>
+        <w:t xml:space="preserve">•  </w:t>
+      </w:r>
+      <w:r>
+        <w:rPr>
+          <w:rFonts w:ascii="Arial" w:hAnsi="Arial"/>
+          <w:b/>
+          <w:color w:val="0F172A"/>
+          <w:sz w:val="19"/>
+        </w:rPr>
+        <w:t xml:space="preserve">DevOps и инструменты: </w:t>
+      </w:r>
+      <w:r>
+        <w:rPr>
+          <w:rFonts w:ascii="Arial" w:hAnsi="Arial"/>
+          <w:color w:val="0F172A"/>
+          <w:sz w:val="19"/>
+        </w:rPr>
+        <w:t>Docker, Docker Compose, Git, GitHub, Linux (Bash), Railway, APScheduler, openpyxl, Pillow</w:t>
+      </w:r>
+    </w:p>
+    <w:p>
+      <w:pPr>
+        <w:spacing w:before="200" w:after="60"/>
+        <w:pBdr>
+          <w:bottom w:val="single" w:sz="8" w:space="2" w:color="0EA5E9"/>
+        </w:pBdr>
+      </w:pPr>
+      <w:r>
+        <w:rPr>
+          <w:rFonts w:ascii="Arial" w:hAnsi="Arial"/>
+          <w:b/>
+          <w:color w:val="0E7490"/>
+          <w:sz w:val="22"/>
+        </w:rPr>
+        <w:t>ПРОЕКТЫ И ПРАКТИЧЕСКИЙ ОПЫТ</w:t>
+      </w:r>
+    </w:p>
+    <w:p>
+      <w:pPr>
+        <w:spacing w:before="80" w:after="20"/>
+      </w:pPr>
+      <w:r>
+        <w:rPr>
+          <w:rFonts w:ascii="Arial" w:hAnsi="Arial"/>
+          <w:b/>
+          <w:color w:val="0E7490"/>
+          <w:sz w:val="20"/>
+        </w:rPr>
+        <w:t>AstroBot — Персональный AI-астролог и Telegram Mini App  |  github.com/Eksailed/astrobot</w:t>
+      </w:r>
+    </w:p>
     <w:p>
       <w:pPr>
         <w:spacing w:before="0" w:after="40"/>
       </w:pPr>
       <w:r>
         <w:rPr>
-          <w:b/>
-          <w:color w:val="0F172A"/>
-          <w:sz w:val="44"/>
-        </w:rPr>
-        <w:t>Рождественский Даниил Андреевич</w:t>
-      </w:r>
-    </w:p>
-    <w:p>
-      <w:pPr>
-        <w:spacing w:before="0" w:after="120"/>
-      </w:pPr>
-      <w:r>
-        <w:rPr>
-          <w:b/>
-          <w:color w:val="2563EB"/>
-          <w:sz w:val="25"/>
-        </w:rPr>
-        <w:t>Junior / Junior+ Python &amp; C# Developer (Backend / Desktop / Telegram Services)</w:t>
-      </w:r>
-    </w:p>
-    <w:p>
-      <w:pPr>
-        <w:spacing w:before="0" w:after="160"/>
-      </w:pPr>
-      <w:r>
-        <w:rPr>
-          <w:b/>
-        </w:rPr>
-        <w:t xml:space="preserve">Локация: </w:t>
-      </w:r>
-      <w:r>
-        <w:t xml:space="preserve">Донецк (готов к удаленной работе / релокации)  |  </w:t>
-      </w:r>
-      <w:r>
-        <w:rPr>
-          <w:b/>
-        </w:rPr>
-        <w:t xml:space="preserve">Занятость: </w:t>
-      </w:r>
-      <w:r>
-        <w:t>Полная, гибкий график</w:t>
-        <w:br/>
-      </w:r>
-      <w:r>
-        <w:rPr>
-          <w:b/>
-        </w:rPr>
-        <w:t xml:space="preserve">Телефон: </w:t>
-      </w:r>
-      <w:r>
-        <w:t xml:space="preserve">+7 (XXX) XXX-XX-XX  |  </w:t>
-      </w:r>
-      <w:r>
-        <w:rPr>
-          <w:b/>
-        </w:rPr>
-        <w:t xml:space="preserve">Email: </w:t>
-      </w:r>
-      <w:r>
-        <w:t xml:space="preserve">daniil.rozhdestvensky@example.com  |  </w:t>
-      </w:r>
-      <w:r>
-        <w:rPr>
-          <w:b/>
-        </w:rPr>
-        <w:t xml:space="preserve">Telegram: </w:t>
-      </w:r>
-      <w:r>
-        <w:t xml:space="preserve">@Eksailed  |  </w:t>
-      </w:r>
-      <w:r>
-        <w:rPr>
-          <w:b/>
-        </w:rPr>
-        <w:t xml:space="preserve">GitHub: </w:t>
-      </w:r>
-      <w:hyperlink r:id="rId9">
-        <w:r>
-          <w:rPr>
-            <w:color w:val="1D4ED8"/>
-            <w:u w:val="single"/>
-          </w:rPr>
-          <w:t>github.com/Eksailed</w:t>
-        </w:r>
-      </w:hyperlink>
-    </w:p>
-    <w:p>
-      <w:pPr>
-        <w:keepNext/>
-        <w:spacing w:before="240" w:after="80"/>
-        <w:pBdr>
-          <w:bottom w:val="single" w:sz="8" w:space="4" w:color="94A3B8"/>
-        </w:pBdr>
-      </w:pPr>
-      <w:r>
-        <w:rPr>
-          <w:rFonts w:ascii="Calibri" w:hAnsi="Calibri"/>
-          <w:b/>
-          <w:color w:val="1E3A8A"/>
-          <w:sz w:val="23"/>
-        </w:rPr>
-        <w:t>О СЕБЕ</w:t>
-      </w:r>
-    </w:p>
-    <w:p>
-      <w:pPr>
-        <w:spacing w:before="60" w:after="120" w:line="276" w:lineRule="auto"/>
-      </w:pPr>
-      <w:r>
-        <w:t>Студент 2-го курса Донецкого национального университета с крепкой базой среднего профессионального образования (выпускник ДТПА) и пройденной срочной службой в армии (вопрос с призывом полностью закрыт, военный билет на руках).</w:t>
-        <w:br/>
-        <w:t>Специализируюсь на разработке на Python (FastAPI, SQLAlchemy 2.0 Async, PostgreSQL, Redis, aiogram) и C# (Windows Forms, WPF, Unity Engine, ООП). Имею практический опыт проектирования модульной архитектуры, прикладных баз данных, работы со сложной предметной логикой, интеграции LLM-моделей (OpenRouter API), создания Telegram Mini Apps на React и контейнеризации в Docker Compose. Быстро погружаюсь в новые технологии, ориентирован на чистый код и инженерное качество решений.</w:t>
-      </w:r>
-    </w:p>
-    <w:p>
-      <w:pPr>
-        <w:keepNext/>
-        <w:spacing w:before="240" w:after="80"/>
-        <w:pBdr>
-          <w:bottom w:val="single" w:sz="8" w:space="4" w:color="94A3B8"/>
-        </w:pBdr>
-      </w:pPr>
-      <w:r>
-        <w:rPr>
-          <w:rFonts w:ascii="Calibri" w:hAnsi="Calibri"/>
-          <w:b/>
-          <w:color w:val="1E3A8A"/>
-          <w:sz w:val="23"/>
-        </w:rPr>
-        <w:t>КЛЮЧЕВЫЕ НАВЫКИ И СТЕК ТЕХНОЛОГИЙ</w:t>
-      </w:r>
-    </w:p>
-    <w:p>
-      <w:pPr>
-        <w:spacing w:before="20" w:after="40"/>
-        <w:ind w:left="216"/>
-      </w:pPr>
-      <w:r>
-        <w:rPr>
-          <w:b/>
-          <w:color w:val="334155"/>
-        </w:rPr>
-        <w:t xml:space="preserve">•  Языки программирования: </w:t>
-      </w:r>
-      <w:r>
-        <w:t>Python 3.10–3.12, C#, C++, SQL, базовый JavaScript / TypeScript</w:t>
-      </w:r>
-    </w:p>
-    <w:p>
-      <w:pPr>
-        <w:spacing w:before="20" w:after="40"/>
-        <w:ind w:left="216"/>
-      </w:pPr>
-      <w:r>
-        <w:rPr>
-          <w:b/>
-          <w:color w:val="334155"/>
-        </w:rPr>
-        <w:t xml:space="preserve">•  Бэкенд и фреймворки: </w:t>
-      </w:r>
-      <w:r>
-        <w:t>FastAPI, Uvicorn, Pydantic v2, aiogram 3.x, python-telegram-bot (v21 async), httpx, aiohttp</w:t>
-      </w:r>
-    </w:p>
-    <w:p>
-      <w:pPr>
-        <w:spacing w:before="20" w:after="40"/>
-        <w:ind w:left="216"/>
-      </w:pPr>
-      <w:r>
-        <w:rPr>
-          <w:b/>
-          <w:color w:val="334155"/>
-        </w:rPr>
-        <w:t xml:space="preserve">•  Базы данных и ORM: </w:t>
-      </w:r>
-      <w:r>
-        <w:t>PostgreSQL, SQLite, SQLAlchemy 2.0 (Asyncio), asyncpg, Alembic (миграции), Redis</w:t>
-      </w:r>
-    </w:p>
-    <w:p>
-      <w:pPr>
-        <w:spacing w:before="20" w:after="40"/>
-        <w:ind w:left="216"/>
-      </w:pPr>
-      <w:r>
-        <w:rPr>
-          <w:b/>
-          <w:color w:val="334155"/>
-        </w:rPr>
-        <w:t xml:space="preserve">•  Интеграции и AI: </w:t>
-      </w:r>
-      <w:r>
-        <w:t>OpenRouter API (Qwen 2.5 72B, GPT), Prompt Engineering, Telegram Stars (эквайринг), REST API, Webhooks, Swiss Ephemeris (pyswisseph), geopy</w:t>
-      </w:r>
-    </w:p>
-    <w:p>
-      <w:pPr>
-        <w:spacing w:before="20" w:after="40"/>
-        <w:ind w:left="216"/>
-      </w:pPr>
-      <w:r>
-        <w:rPr>
-          <w:b/>
-          <w:color w:val="334155"/>
-        </w:rPr>
-        <w:t xml:space="preserve">•  Frontend / Mini Apps: </w:t>
-      </w:r>
-      <w:r>
-        <w:t>React 18, Vite, Tailwind CSS, @telegram-apps/sdk-react</w:t>
-      </w:r>
-    </w:p>
-    <w:p>
-      <w:pPr>
-        <w:spacing w:before="20" w:after="40"/>
-        <w:ind w:left="216"/>
-      </w:pPr>
-      <w:r>
-        <w:rPr>
-          <w:b/>
-          <w:color w:val="334155"/>
-        </w:rPr>
-        <w:t xml:space="preserve">•  Десктоп и GUI: </w:t>
-      </w:r>
-      <w:r>
-        <w:t>Windows Forms (C#), WPF, прикладные базы данных, алгоритмы на C++</w:t>
-      </w:r>
-    </w:p>
-    <w:p>
-      <w:pPr>
-        <w:spacing w:before="20" w:after="40"/>
-        <w:ind w:left="216"/>
-      </w:pPr>
-      <w:r>
-        <w:rPr>
-          <w:b/>
-          <w:color w:val="334155"/>
-        </w:rPr>
-        <w:t xml:space="preserve">•  Геймдев: </w:t>
-      </w:r>
-      <w:r>
-        <w:t>C#, Unity Engine (ООП, паттерны, архитектура компонентов, конечные автоматы FSM)</w:t>
-      </w:r>
-    </w:p>
-    <w:p>
-      <w:pPr>
-        <w:spacing w:before="20" w:after="40"/>
-        <w:ind w:left="216"/>
-      </w:pPr>
-      <w:r>
-        <w:rPr>
-          <w:b/>
-          <w:color w:val="334155"/>
-        </w:rPr>
-        <w:t xml:space="preserve">•  DevOps и инструменты: </w:t>
-      </w:r>
-      <w:r>
-        <w:t>Docker, Docker Compose, Git, GitHub, Linux (Bash), Railway, Render, APScheduler, openpyxl</w:t>
-      </w:r>
-    </w:p>
-    <w:p>
-      <w:pPr>
-        <w:keepNext/>
-        <w:spacing w:before="240" w:after="80"/>
-        <w:pBdr>
-          <w:bottom w:val="single" w:sz="8" w:space="4" w:color="94A3B8"/>
-        </w:pBdr>
-      </w:pPr>
-      <w:r>
-        <w:rPr>
-          <w:rFonts w:ascii="Calibri" w:hAnsi="Calibri"/>
-          <w:b/>
-          <w:color w:val="1E3A8A"/>
-          <w:sz w:val="23"/>
-        </w:rPr>
-        <w:t>ПРОЕКТЫ И ПРАКТИЧЕСКИЙ ОПЫТ</w:t>
-      </w:r>
-    </w:p>
-    <w:p>
-      <w:pPr>
-        <w:keepNext/>
-        <w:spacing w:before="100" w:after="20"/>
-      </w:pPr>
-      <w:r>
-        <w:rPr>
-          <w:b/>
-          <w:sz w:val="21"/>
-        </w:rPr>
-        <w:t>AstroBot — Персональный AI-астролог и Telegram Mini App</w:t>
-      </w:r>
-      <w:r>
-        <w:t xml:space="preserve">  |  </w:t>
-      </w:r>
-      <w:hyperlink r:id="rId10">
-        <w:r>
-          <w:rPr>
-            <w:color w:val="1D4ED8"/>
-            <w:u w:val="single"/>
-          </w:rPr>
-          <w:t>Репозиторий на GitHub</w:t>
-        </w:r>
-      </w:hyperlink>
-    </w:p>
-    <w:p>
-      <w:pPr>
-        <w:keepNext/>
-        <w:spacing w:before="0" w:after="60"/>
-      </w:pPr>
-      <w:r>
-        <w:rPr>
+          <w:rFonts w:ascii="Arial" w:hAnsi="Arial"/>
           <w:i/>
-          <w:color w:val="4B5563"/>
-          <w:sz w:val="18"/>
+          <w:color w:val="475569"/>
+          <w:sz w:val="17"/>
         </w:rPr>
         <w:t>Стек: Python 3.11, aiogram 3.x, FastAPI, SQLAlchemy 2.0 Async, asyncpg, Redis, Docker Compose, React 18, OpenRouter API</w:t>
       </w:r>
@@ -331,7 +379,20 @@
         <w:ind w:left="288"/>
       </w:pPr>
       <w:r>
-        <w:t>•  Спроектировал модульную архитектуру с жестким разделением ответственности (bot, api, services, db/repositories, webapp).</w:t>
+        <w:rPr>
+          <w:rFonts w:ascii="Arial" w:hAnsi="Arial"/>
+          <w:color w:val="0E7490"/>
+          <w:sz w:val="19"/>
+        </w:rPr>
+        <w:t xml:space="preserve">•  </w:t>
+      </w:r>
+      <w:r>
+        <w:rPr>
+          <w:rFonts w:ascii="Arial" w:hAnsi="Arial"/>
+          <w:color w:val="0F172A"/>
+          <w:sz w:val="19"/>
+        </w:rPr>
+        <w:t>Спроектировал модульную архитектуру сервиса с жестким разделением слоев (bot, api, services, repositories, webapp).</w:t>
       </w:r>
     </w:p>
     <w:p>
@@ -340,7 +401,20 @@
         <w:ind w:left="288"/>
       </w:pPr>
       <w:r>
-        <w:t>•  Разработал REST API на FastAPI для Telegram Mini App с криптографической проверкой подлинности сессий (HMAC-SHA256 initData).</w:t>
+        <w:rPr>
+          <w:rFonts w:ascii="Arial" w:hAnsi="Arial"/>
+          <w:color w:val="0E7490"/>
+          <w:sz w:val="19"/>
+        </w:rPr>
+        <w:t xml:space="preserve">•  </w:t>
+      </w:r>
+      <w:r>
+        <w:rPr>
+          <w:rFonts w:ascii="Arial" w:hAnsi="Arial"/>
+          <w:color w:val="0F172A"/>
+          <w:sz w:val="19"/>
+        </w:rPr>
+        <w:t>Разработал REST API на FastAPI с криптографической верификацией Telegram WebApp initData (HMAC-SHA256).</w:t>
       </w:r>
     </w:p>
     <w:p>
@@ -349,7 +423,20 @@
         <w:ind w:left="288"/>
       </w:pPr>
       <w:r>
-        <w:t>•  Построил асинхронный слой работы с PostgreSQL через SQLAlchemy 2.0 + asyncpg, настроил систему миграций Alembic и паттерн Repository.</w:t>
+        <w:rPr>
+          <w:rFonts w:ascii="Arial" w:hAnsi="Arial"/>
+          <w:color w:val="0E7490"/>
+          <w:sz w:val="19"/>
+        </w:rPr>
+        <w:t xml:space="preserve">•  </w:t>
+      </w:r>
+      <w:r>
+        <w:rPr>
+          <w:rFonts w:ascii="Arial" w:hAnsi="Arial"/>
+          <w:color w:val="0F172A"/>
+          <w:sz w:val="19"/>
+        </w:rPr>
+        <w:t>Построил асинхронный доступ к PostgreSQL через SQLAlchemy 2.0 + asyncpg с миграциями Alembic и кэшированием лимитов в Redis.</w:t>
       </w:r>
     </w:p>
     <w:p>
@@ -358,7 +445,48 @@
         <w:ind w:left="288"/>
       </w:pPr>
       <w:r>
-        <w:t>•  Интегрировал OpenRouter API (Qwen 2.5 72B) с алгоритмом динамической контекстной инъекции натальных параметров пользователя.</w:t>
+        <w:rPr>
+          <w:rFonts w:ascii="Arial" w:hAnsi="Arial"/>
+          <w:color w:val="0E7490"/>
+          <w:sz w:val="19"/>
+        </w:rPr>
+        <w:t xml:space="preserve">•  </w:t>
+      </w:r>
+      <w:r>
+        <w:rPr>
+          <w:rFonts w:ascii="Arial" w:hAnsi="Arial"/>
+          <w:color w:val="0F172A"/>
+          <w:sz w:val="19"/>
+        </w:rPr>
+        <w:t>Интегрировал LLM Qwen 2.5 72B через OpenRouter с динамической инъекцией натального паспорта, монетизацию Telegram Stars и Docker Compose.</w:t>
+      </w:r>
+    </w:p>
+    <w:p>
+      <w:pPr>
+        <w:spacing w:before="80" w:after="20"/>
+      </w:pPr>
+      <w:r>
+        <w:rPr>
+          <w:rFonts w:ascii="Arial" w:hAnsi="Arial"/>
+          <w:b/>
+          <w:color w:val="0E7490"/>
+          <w:sz w:val="20"/>
+        </w:rPr>
+        <w:t>VR-Тренажёр — Интерактивный симулятор на Unity 6  |  github.com/Eksailed/vrgametest</w:t>
+      </w:r>
+    </w:p>
+    <w:p>
+      <w:pPr>
+        <w:spacing w:before="0" w:after="40"/>
+      </w:pPr>
+      <w:r>
+        <w:rPr>
+          <w:rFonts w:ascii="Arial" w:hAnsi="Arial"/>
+          <w:i/>
+          <w:color w:val="475569"/>
+          <w:sz w:val="17"/>
+        </w:rPr>
+        <w:t>Стек: C#, Unity 6000.0, XR Interaction Toolkit 3.0.7, OpenXR 1.14.0, Unity Input System, XR Device Simulator</w:t>
       </w:r>
     </w:p>
     <w:p>
@@ -367,7 +495,20 @@
         <w:ind w:left="288"/>
       </w:pPr>
       <w:r>
-        <w:t>•  Внедрил Redis для кэширования и строгого контроля суточных лимитов запросов (Rate Limiting).</w:t>
+        <w:rPr>
+          <w:rFonts w:ascii="Arial" w:hAnsi="Arial"/>
+          <w:color w:val="0E7490"/>
+          <w:sz w:val="19"/>
+        </w:rPr>
+        <w:t xml:space="preserve">•  </w:t>
+      </w:r>
+      <w:r>
+        <w:rPr>
+          <w:rFonts w:ascii="Arial" w:hAnsi="Arial"/>
+          <w:color w:val="0F172A"/>
+          <w:sz w:val="19"/>
+        </w:rPr>
+        <w:t>Разработал симуляцию последовательности действий пользователя в VR-тренажёре для отработки процедурных регламентов.</w:t>
       </w:r>
     </w:p>
     <w:p>
@@ -376,7 +517,20 @@
         <w:ind w:left="288"/>
       </w:pPr>
       <w:r>
-        <w:t>•  Реализовал астрономические расчеты через pyswisseph (Swiss Ephemeris) и автоматическое геокодирование городов в координаты и UTC через geopy и timezonefinder.</w:t>
+        <w:rPr>
+          <w:rFonts w:ascii="Arial" w:hAnsi="Arial"/>
+          <w:color w:val="0E7490"/>
+          <w:sz w:val="19"/>
+        </w:rPr>
+        <w:t xml:space="preserve">•  </w:t>
+      </w:r>
+      <w:r>
+        <w:rPr>
+          <w:rFonts w:ascii="Arial" w:hAnsi="Arial"/>
+          <w:color w:val="0F172A"/>
+          <w:sz w:val="19"/>
+        </w:rPr>
+        <w:t>Реализовал бесшовное переключение на лету между VR-режимом (шлемы Meta Quest / SteamVR / эмулятор) и режимом ПК (WASD + мышь) по F1.</w:t>
       </w:r>
     </w:p>
     <w:p>
@@ -385,7 +539,48 @@
         <w:ind w:left="288"/>
       </w:pPr>
       <w:r>
-        <w:t>•  Подключил монетизацию через Telegram Stars (XTR) и реализовал механизм полного удаления пользовательских данных (/delete, GDPR compliance).</w:t>
+        <w:rPr>
+          <w:rFonts w:ascii="Arial" w:hAnsi="Arial"/>
+          <w:color w:val="0E7490"/>
+          <w:sz w:val="19"/>
+        </w:rPr>
+        <w:t xml:space="preserve">•  </w:t>
+      </w:r>
+      <w:r>
+        <w:rPr>
+          <w:rFonts w:ascii="Arial" w:hAnsi="Arial"/>
+          <w:color w:val="0F172A"/>
+          <w:sz w:val="19"/>
+        </w:rPr>
+        <w:t>Внедрил физические интеракции: захват предметов контроллерами/лучами, позиционирование деталей в посадочные сокеты, поворотные рычаги.</w:t>
+      </w:r>
+    </w:p>
+    <w:p>
+      <w:pPr>
+        <w:spacing w:before="80" w:after="20"/>
+      </w:pPr>
+      <w:r>
+        <w:rPr>
+          <w:rFonts w:ascii="Arial" w:hAnsi="Arial"/>
+          <w:b/>
+          <w:color w:val="0E7490"/>
+          <w:sz w:val="20"/>
+        </w:rPr>
+        <w:t>Котопокалипсис: Выживание — Roguelite на Phaser 3 под Яндекс.Игры  |  github.com/Eksailed/CatGame</w:t>
+      </w:r>
+    </w:p>
+    <w:p>
+      <w:pPr>
+        <w:spacing w:before="0" w:after="40"/>
+      </w:pPr>
+      <w:r>
+        <w:rPr>
+          <w:rFonts w:ascii="Arial" w:hAnsi="Arial"/>
+          <w:i/>
+          <w:color w:val="475569"/>
+          <w:sz w:val="17"/>
+        </w:rPr>
+        <w:t>Стек: JavaScript (ES6+), Phaser 3, WebGL Canvas, HTML5/CSS3, Python (генерация ассетов и сборка)</w:t>
       </w:r>
     </w:p>
     <w:p>
@@ -394,46 +589,20 @@
         <w:ind w:left="288"/>
       </w:pPr>
       <w:r>
-        <w:t>•  Полностью упаковал инфраструктуру (PostgreSQL, Redis, Bot, FastAPI) в единый Docker Compose для быстрого развертывания.</w:t>
+        <w:rPr>
+          <w:rFonts w:ascii="Arial" w:hAnsi="Arial"/>
+          <w:color w:val="0E7490"/>
+          <w:sz w:val="19"/>
+        </w:rPr>
+        <w:t xml:space="preserve">•  </w:t>
       </w:r>
-    </w:p>
-    <w:p>
-      <w:pPr>
-        <w:keepNext/>
-        <w:spacing w:before="120" w:after="20"/>
-      </w:pPr>
       <w:r>
         <w:rPr>
-          <w:b/>
-          <w:sz w:val="21"/>
+          <w:rFonts w:ascii="Arial" w:hAnsi="Arial"/>
+          <w:color w:val="0F172A"/>
+          <w:sz w:val="19"/>
         </w:rPr>
-        <w:t>Football Bot — Сервис футбольной аналитики и уведомлений</w:t>
-      </w:r>
-      <w:r>
-        <w:t xml:space="preserve">  |  </w:t>
-      </w:r>
-      <w:hyperlink r:id="rId11">
-        <w:r>
-          <w:rPr>
-            <w:color w:val="1D4ED8"/>
-            <w:u w:val="single"/>
-          </w:rPr>
-          <w:t>Репозиторий на GitHub</w:t>
-        </w:r>
-      </w:hyperlink>
-    </w:p>
-    <w:p>
-      <w:pPr>
-        <w:keepNext/>
-        <w:spacing w:before="0" w:after="60"/>
-      </w:pPr>
-      <w:r>
-        <w:rPr>
-          <w:i/>
-          <w:color w:val="4B5563"/>
-          <w:sz w:val="18"/>
-        </w:rPr>
-        <w:t>Стек: Python, python-telegram-bot (async), PostgreSQL, APScheduler, openpyxl, Railway</w:t>
+        <w:t>Создал Roguelite-экшен в стиле Vampire Survivors с автоприцелом, волновым спавном орд врагов, боссами и развитием способностей.</w:t>
       </w:r>
     </w:p>
     <w:p>
@@ -442,7 +611,20 @@
         <w:ind w:left="288"/>
       </w:pPr>
       <w:r>
-        <w:t>•  Разработал сервис мониторинга топ-7 европейских футбольных лиг с получением данных через внешние спортивные REST API.</w:t>
+        <w:rPr>
+          <w:rFonts w:ascii="Arial" w:hAnsi="Arial"/>
+          <w:color w:val="0E7490"/>
+          <w:sz w:val="19"/>
+        </w:rPr>
+        <w:t xml:space="preserve">•  </w:t>
+      </w:r>
+      <w:r>
+        <w:rPr>
+          <w:rFonts w:ascii="Arial" w:hAnsi="Arial"/>
+          <w:color w:val="0F172A"/>
+          <w:sz w:val="19"/>
+        </w:rPr>
+        <w:t>Запрограммировал 14 уникальных видов оружия и пассивных навыков (бумеранги, ауры, лазеры, мины, цепные молнии).</w:t>
       </w:r>
     </w:p>
     <w:p>
@@ -451,7 +633,48 @@
         <w:ind w:left="288"/>
       </w:pPr>
       <w:r>
-        <w:t>•  Настроил фоновый планировщик задач (APScheduler) для своевременного парсинга матчей и отправки уведомлений пользователям.</w:t>
+        <w:rPr>
+          <w:rFonts w:ascii="Arial" w:hAnsi="Arial"/>
+          <w:color w:val="0E7490"/>
+          <w:sz w:val="19"/>
+        </w:rPr>
+        <w:t xml:space="preserve">•  </w:t>
+      </w:r>
+      <w:r>
+        <w:rPr>
+          <w:rFonts w:ascii="Arial" w:hAnsi="Arial"/>
+          <w:color w:val="0F172A"/>
+          <w:sz w:val="19"/>
+        </w:rPr>
+        <w:t>Разработал автоматизированный Python-пайплайн для процедурной нарезки анимированных спрайтшитов и сборки zip-билдов.</w:t>
+      </w:r>
+    </w:p>
+    <w:p>
+      <w:pPr>
+        <w:spacing w:before="80" w:after="20"/>
+      </w:pPr>
+      <w:r>
+        <w:rPr>
+          <w:rFonts w:ascii="Arial" w:hAnsi="Arial"/>
+          <w:b/>
+          <w:color w:val="0E7490"/>
+          <w:sz w:val="20"/>
+        </w:rPr>
+        <w:t>Эволюция Слаймов (SlimeCleeker) — Merge &amp; Clicker с Yandex Games SDK v2  |  github.com/Eksailed/SlimeCleeker</w:t>
+      </w:r>
+    </w:p>
+    <w:p>
+      <w:pPr>
+        <w:spacing w:before="0" w:after="40"/>
+      </w:pPr>
+      <w:r>
+        <w:rPr>
+          <w:rFonts w:ascii="Arial" w:hAnsi="Arial"/>
+          <w:i/>
+          <w:color w:val="475569"/>
+          <w:sz w:val="17"/>
+        </w:rPr>
+        <w:t>Стек: JavaScript, Yandex Games SDK v2, CSS3, HTML5, Cloud Storage</w:t>
       </w:r>
     </w:p>
     <w:p>
@@ -460,7 +683,20 @@
         <w:ind w:left="288"/>
       </w:pPr>
       <w:r>
-        <w:t>•  Реализовал генерацию сводных отчетов в Excel (.xlsx) с кастомным форматированием стилей и таблиц с помощью openpyxl.</w:t>
+        <w:rPr>
+          <w:rFonts w:ascii="Arial" w:hAnsi="Arial"/>
+          <w:color w:val="0E7490"/>
+          <w:sz w:val="19"/>
+        </w:rPr>
+        <w:t xml:space="preserve">•  </w:t>
+      </w:r>
+      <w:r>
+        <w:rPr>
+          <w:rFonts w:ascii="Arial" w:hAnsi="Arial"/>
+          <w:color w:val="0F172A"/>
+          <w:sz w:val="19"/>
+        </w:rPr>
+        <w:t>Реализовал систему слияния 4x4, инкубатор яиц, 20 уровней эволюции, 5 веток прокачки и подсчет оффлайн-дохода.</w:t>
       </w:r>
     </w:p>
     <w:p>
@@ -469,46 +705,37 @@
         <w:ind w:left="288"/>
       </w:pPr>
       <w:r>
-        <w:t>•  Развернул продакшн-окружение на базе Railway с постоянным подключением к облачной PostgreSQL.</w:t>
+        <w:rPr>
+          <w:rFonts w:ascii="Arial" w:hAnsi="Arial"/>
+          <w:color w:val="0E7490"/>
+          <w:sz w:val="19"/>
+        </w:rPr>
+        <w:t xml:space="preserve">•  </w:t>
+      </w:r>
+      <w:r>
+        <w:rPr>
+          <w:rFonts w:ascii="Arial" w:hAnsi="Arial"/>
+          <w:color w:val="0F172A"/>
+          <w:sz w:val="19"/>
+        </w:rPr>
+        <w:t>Интегрировал монетизацию Yandex Games SDK: Rewarded Video (удвоение прибыли, сундуки), Interstitial рекламу с умным кулдауном и облачные сохранения.</w:t>
       </w:r>
     </w:p>
     <w:p>
       <w:pPr>
-        <w:keepNext/>
-        <w:spacing w:before="120" w:after="20"/>
+        <w:spacing w:before="200" w:after="60"/>
+        <w:pBdr>
+          <w:bottom w:val="single" w:sz="8" w:space="2" w:color="0EA5E9"/>
+        </w:pBdr>
       </w:pPr>
       <w:r>
         <w:rPr>
+          <w:rFonts w:ascii="Arial" w:hAnsi="Arial"/>
           <w:b/>
-          <w:sz w:val="21"/>
+          <w:color w:val="0E7490"/>
+          <w:sz w:val="22"/>
         </w:rPr>
-        <w:t>TheBestGameEver — 3D Action / Shooter на Unity</w:t>
-      </w:r>
-      <w:r>
-        <w:t xml:space="preserve">  |  </w:t>
-      </w:r>
-      <w:hyperlink r:id="rId12">
-        <w:r>
-          <w:rPr>
-            <w:color w:val="1D4ED8"/>
-            <w:u w:val="single"/>
-          </w:rPr>
-          <w:t>Репозиторий на GitHub</w:t>
-        </w:r>
-      </w:hyperlink>
-    </w:p>
-    <w:p>
-      <w:pPr>
-        <w:keepNext/>
-        <w:spacing w:before="0" w:after="60"/>
-      </w:pPr>
-      <w:r>
-        <w:rPr>
-          <w:i/>
-          <w:color w:val="4B5563"/>
-          <w:sz w:val="18"/>
-        </w:rPr>
-        <w:t>Стек: C#, Unity Engine, Finite State Machines (FSM), ООП</w:t>
+        <w:t>ОБРАЗОВАНИЕ И ВОИНСКИЙ УЧЕТ</w:t>
       </w:r>
     </w:p>
     <w:p>
@@ -517,7 +744,29 @@
         <w:ind w:left="288"/>
       </w:pPr>
       <w:r>
-        <w:t>•  Разработал игровую механику от первого/третьего лица: контроллер передвижения, систему вооружения и снарядов.</w:t>
+        <w:rPr>
+          <w:rFonts w:ascii="Arial" w:hAnsi="Arial"/>
+          <w:color w:val="0E7490"/>
+          <w:sz w:val="19"/>
+        </w:rPr>
+        <w:t xml:space="preserve">•  </w:t>
+      </w:r>
+      <w:r>
+        <w:rPr>
+          <w:rFonts w:ascii="Arial" w:hAnsi="Arial"/>
+          <w:b/>
+          <w:color w:val="0F172A"/>
+          <w:sz w:val="19"/>
+        </w:rPr>
+        <w:t xml:space="preserve">Высшее: </w:t>
+      </w:r>
+      <w:r>
+        <w:rPr>
+          <w:rFonts w:ascii="Arial" w:hAnsi="Arial"/>
+          <w:color w:val="0F172A"/>
+          <w:sz w:val="19"/>
+        </w:rPr>
+        <w:t>2023 — настоящее время: Донецкий национальный университет (ДонНУ / ДонГУ), Факультет математики и информационных технологий, 2 курс бакалавриата.</w:t>
       </w:r>
     </w:p>
     <w:p>
@@ -526,7 +775,29 @@
         <w:ind w:left="288"/>
       </w:pPr>
       <w:r>
-        <w:t>•  Реализовал логику искусственного интеллекта врагов на конечных автоматах (Enemy AI FSM) и параметрические спавнеры волн.</w:t>
+        <w:rPr>
+          <w:rFonts w:ascii="Arial" w:hAnsi="Arial"/>
+          <w:color w:val="0E7490"/>
+          <w:sz w:val="19"/>
+        </w:rPr>
+        <w:t xml:space="preserve">•  </w:t>
+      </w:r>
+      <w:r>
+        <w:rPr>
+          <w:rFonts w:ascii="Arial" w:hAnsi="Arial"/>
+          <w:b/>
+          <w:color w:val="0F172A"/>
+          <w:sz w:val="19"/>
+        </w:rPr>
+        <w:t xml:space="preserve">Среднее профессиональное: </w:t>
+      </w:r>
+      <w:r>
+        <w:rPr>
+          <w:rFonts w:ascii="Arial" w:hAnsi="Arial"/>
+          <w:color w:val="0F172A"/>
+          <w:sz w:val="19"/>
+        </w:rPr>
+        <w:t>Донецкий техникум промышленной автоматики (ДТПА), диплом о среднем профессиональном образовании (СПО).</w:t>
       </w:r>
     </w:p>
     <w:p>
@@ -535,158 +806,34 @@
         <w:ind w:left="288"/>
       </w:pPr>
       <w:r>
-        <w:t>•  Отработал паттерны объектно-ориентированного программирования и управления игровым состоянием.</w:t>
-      </w:r>
-    </w:p>
-    <w:p>
-      <w:pPr>
-        <w:keepNext/>
-        <w:spacing w:before="240" w:after="80"/>
-        <w:pBdr>
-          <w:bottom w:val="single" w:sz="8" w:space="4" w:color="94A3B8"/>
-        </w:pBdr>
-      </w:pPr>
-      <w:r>
         <w:rPr>
-          <w:rFonts w:ascii="Calibri" w:hAnsi="Calibri"/>
-          <w:b/>
-          <w:color w:val="1E3A8A"/>
-          <w:sz w:val="23"/>
+          <w:rFonts w:ascii="Arial" w:hAnsi="Arial"/>
+          <w:color w:val="0E7490"/>
+          <w:sz w:val="19"/>
         </w:rPr>
-        <w:t>ОБРАЗОВАНИЕ</w:t>
-      </w:r>
-    </w:p>
-    <w:p>
-      <w:pPr>
-        <w:spacing w:before="60" w:after="20"/>
-      </w:pPr>
-      <w:r>
-        <w:rPr>
-          <w:b/>
-        </w:rPr>
-        <w:t>2023 — настоящее время  |  Донецкий национальный университет (ДонНУ / ДонГУ)</w:t>
-      </w:r>
-    </w:p>
-    <w:p>
-      <w:pPr>
-        <w:spacing w:before="0" w:after="80"/>
-        <w:ind w:left="216"/>
-      </w:pPr>
-      <w:r>
-        <w:t>Факультет математики и информационных технологий / Компьютерных наук</w:t>
-        <w:br/>
-        <w:t>Специальность: Программная инженерия / IT (2 курс бакалавриата)</w:t>
-      </w:r>
-    </w:p>
-    <w:p>
-      <w:pPr>
-        <w:spacing w:before="60" w:after="20"/>
-      </w:pPr>
-      <w:r>
-        <w:rPr>
-          <w:b/>
-        </w:rPr>
-        <w:t>Окончил  |  Донецкий техникум промышленной автоматики (ДТПА)</w:t>
-      </w:r>
-    </w:p>
-    <w:p>
-      <w:pPr>
-        <w:spacing w:before="0" w:after="80"/>
-        <w:ind w:left="216"/>
-      </w:pPr>
-      <w:r>
-        <w:t>Диплом о среднем профессиональном образовании (СПО) в сфере автоматизации и информационных систем</w:t>
-      </w:r>
-    </w:p>
-    <w:p>
-      <w:pPr>
-        <w:keepNext/>
-        <w:spacing w:before="240" w:after="80"/>
-        <w:pBdr>
-          <w:bottom w:val="single" w:sz="8" w:space="4" w:color="94A3B8"/>
-        </w:pBdr>
-      </w:pPr>
-      <w:r>
-        <w:rPr>
-          <w:rFonts w:ascii="Calibri" w:hAnsi="Calibri"/>
-          <w:b/>
-          <w:color w:val="1E3A8A"/>
-          <w:sz w:val="23"/>
-        </w:rPr>
-        <w:t>ВОИНСКИЙ УЧЕТ</w:t>
-      </w:r>
-    </w:p>
-    <w:p>
-      <w:pPr>
-        <w:spacing w:before="60" w:after="80"/>
-        <w:ind w:left="216"/>
-      </w:pPr>
-      <w:r>
-        <w:rPr>
-          <w:b/>
-        </w:rPr>
-        <w:t xml:space="preserve">•  Срочная служба в Вооруженных Силах: </w:t>
-      </w:r>
-      <w:r>
-        <w:t>Пройдена (демобилизован).</w:t>
-        <w:br/>
+        <w:t xml:space="preserve">•  </w:t>
       </w:r>
       <w:r>
         <w:rPr>
+          <w:rFonts w:ascii="Arial" w:hAnsi="Arial"/>
           <w:b/>
+          <w:color w:val="0F172A"/>
+          <w:sz w:val="19"/>
         </w:rPr>
-        <w:t xml:space="preserve">•  Статус: </w:t>
-      </w:r>
-      <w:r>
-        <w:t>Военнообязанный, военный билет на руках, юридический вопрос с призывом на срочную службу закрыт полностью.</w:t>
-      </w:r>
-    </w:p>
-    <w:p>
-      <w:pPr>
-        <w:keepNext/>
-        <w:spacing w:before="240" w:after="80"/>
-        <w:pBdr>
-          <w:bottom w:val="single" w:sz="8" w:space="4" w:color="94A3B8"/>
-        </w:pBdr>
-      </w:pPr>
-      <w:r>
-        <w:rPr>
-          <w:rFonts w:ascii="Calibri" w:hAnsi="Calibri"/>
-          <w:b/>
-          <w:color w:val="1E3A8A"/>
-          <w:sz w:val="23"/>
-        </w:rPr>
-        <w:t>ЯЗЫКИ И ЛИЧНЫЕ КАЧЕСТВА</w:t>
-      </w:r>
-    </w:p>
-    <w:p>
-      <w:pPr>
-        <w:spacing w:before="60" w:after="40"/>
-        <w:ind w:left="216"/>
-      </w:pPr>
-      <w:r>
-        <w:rPr>
-          <w:b/>
-        </w:rPr>
-        <w:t xml:space="preserve">•  Английский язык: </w:t>
-      </w:r>
-      <w:r>
-        <w:t>Уровень A2–B1 (уверенное чтение технической документации, API, StackOverflow, профильной литературы).</w:t>
-        <w:br/>
+        <w:t xml:space="preserve">Воинский учет: </w:t>
       </w:r>
       <w:r>
         <w:rPr>
-          <w:b/>
+          <w:rFonts w:ascii="Arial" w:hAnsi="Arial"/>
+          <w:color w:val="0F172A"/>
+          <w:sz w:val="19"/>
         </w:rPr>
-        <w:t xml:space="preserve">•  Личные качества: </w:t>
-      </w:r>
-      <w:r>
-        <w:t>Высокая самодисциплина, ответственность, способность автономно находить архитектурные решения и доводить разработку до готового релизного продукта.</w:t>
+        <w:t>Срочная служба в Вооруженных Силах пройдена (демобилизован). Статус: военнообязанный, военный билет на руках. Юридический вопрос с призывом закрыт полностью.</w:t>
       </w:r>
     </w:p>
     <w:sectPr>
       <w:pgSz w:w="12240" w:h="15840"/>
-      <w:pgMar w:top="864" w:right="1008" w:bottom="864" w:left="1008" w:header="720" w:footer="720" w:gutter="0"/>
+      <w:pgMar w:top="720" w:right="720" w:bottom="720" w:left="720" w:header="720" w:footer="720" w:gutter="0"/>
       <w:cols w:space="720"/>
       <w:docGrid w:linePitch="360"/>
     </w:sectPr>
@@ -1057,11 +1204,6 @@
     <w:name w:val="Normal"/>
     <w:qFormat/>
     <w:rsid w:val="00FC693F"/>
-    <w:rPr>
-      <w:rFonts w:ascii="Calibri" w:hAnsi="Calibri"/>
-      <w:color w:val="1F2937"/>
-      <w:sz w:val="20"/>
-    </w:rPr>
   </w:style>
   <w:style w:type="paragraph" w:styleId="Header">
     <w:name w:val="header"/>

</xml_diff>